<commit_message>
Creación del documento de diseño de arquitectura
</commit_message>
<xml_diff>
--- a/SRS/SRS.docx
+++ b/SRS/SRS.docx
@@ -65,7 +65,9 @@
     <w:p>
       <w:pPr>
         <w:jc w:val="center"/>
-        <w:rPr/>
+        <w:rPr>
+          <w:color w:val="1f3864"/>
+        </w:rPr>
       </w:pPr>
       <w:r>
         <w:rPr>
@@ -156,7 +158,7 @@
           <w:szCs w:val="26"/>
           <w:rtl w:val="0"/>
         </w:rPr>
-        <w:t xml:space="preserve">Versión 0.1</w:t>
+        <w:t xml:space="preserve">Versión 1.4</w:t>
       </w:r>
       <w:r>
         <w:rPr>
@@ -503,7 +505,7 @@
               <w:bottom w:color="bdc3c7" w:space="0" w:sz="4" w:val="single"/>
               <w:right w:color="bdc3c7" w:space="0" w:sz="4" w:val="single"/>
             </w:tcBorders>
-            <w:shd w:fill="f5f7fa" w:val="clear"/>
+            <w:shd w:fill="ffffff" w:val="clear"/>
             <w:tcMar>
               <w:top w:w="80.0" w:type="dxa"/>
               <w:left w:w="160.0" w:type="dxa"/>
@@ -513,10 +515,15 @@
           </w:tcPr>
           <w:p>
             <w:pPr>
-              <w:rPr/>
-            </w:pPr>
-            <w:r>
-              <w:rPr>
+              <w:rPr>
+                <w:sz w:val="20"/>
+                <w:szCs w:val="20"/>
+              </w:rPr>
+            </w:pPr>
+            <w:r>
+              <w:rPr>
+                <w:sz w:val="20"/>
+                <w:szCs w:val="20"/>
                 <w:rtl w:val="0"/>
               </w:rPr>
               <w:t xml:space="preserve">Danna</w:t>
@@ -531,7 +538,7 @@
               <w:bottom w:color="bdc3c7" w:space="0" w:sz="4" w:val="single"/>
               <w:right w:color="bdc3c7" w:space="0" w:sz="4" w:val="single"/>
             </w:tcBorders>
-            <w:shd w:fill="f5f7fa" w:val="clear"/>
+            <w:shd w:fill="ffffff" w:val="clear"/>
             <w:tcMar>
               <w:top w:w="80.0" w:type="dxa"/>
               <w:left w:w="160.0" w:type="dxa"/>
@@ -541,10 +548,15 @@
           </w:tcPr>
           <w:p>
             <w:pPr>
-              <w:rPr/>
-            </w:pPr>
-            <w:r>
-              <w:rPr>
+              <w:rPr>
+                <w:sz w:val="20"/>
+                <w:szCs w:val="20"/>
+              </w:rPr>
+            </w:pPr>
+            <w:r>
+              <w:rPr>
+                <w:sz w:val="20"/>
+                <w:szCs w:val="20"/>
                 <w:rtl w:val="0"/>
               </w:rPr>
               <w:t xml:space="preserve">9/04/2026</w:t>
@@ -559,7 +571,7 @@
               <w:bottom w:color="bdc3c7" w:space="0" w:sz="4" w:val="single"/>
               <w:right w:color="bdc3c7" w:space="0" w:sz="4" w:val="single"/>
             </w:tcBorders>
-            <w:shd w:fill="f5f7fa" w:val="clear"/>
+            <w:shd w:fill="ffffff" w:val="clear"/>
             <w:tcMar>
               <w:top w:w="80.0" w:type="dxa"/>
               <w:left w:w="160.0" w:type="dxa"/>
@@ -569,10 +581,15 @@
           </w:tcPr>
           <w:p>
             <w:pPr>
-              <w:rPr/>
-            </w:pPr>
-            <w:r>
-              <w:rPr>
+              <w:rPr>
+                <w:sz w:val="20"/>
+                <w:szCs w:val="20"/>
+              </w:rPr>
+            </w:pPr>
+            <w:r>
+              <w:rPr>
+                <w:sz w:val="20"/>
+                <w:szCs w:val="20"/>
                 <w:rtl w:val="0"/>
               </w:rPr>
               <w:t xml:space="preserve">Creación inicial del documento SRS</w:t>
@@ -587,7 +604,7 @@
               <w:bottom w:color="bdc3c7" w:space="0" w:sz="4" w:val="single"/>
               <w:right w:color="bdc3c7" w:space="0" w:sz="4" w:val="single"/>
             </w:tcBorders>
-            <w:shd w:fill="f5f7fa" w:val="clear"/>
+            <w:shd w:fill="ffffff" w:val="clear"/>
             <w:tcMar>
               <w:top w:w="80.0" w:type="dxa"/>
               <w:left w:w="160.0" w:type="dxa"/>
@@ -597,10 +614,15 @@
           </w:tcPr>
           <w:p>
             <w:pPr>
-              <w:rPr/>
-            </w:pPr>
-            <w:r>
-              <w:rPr>
+              <w:rPr>
+                <w:sz w:val="20"/>
+                <w:szCs w:val="20"/>
+              </w:rPr>
+            </w:pPr>
+            <w:r>
+              <w:rPr>
+                <w:sz w:val="20"/>
+                <w:szCs w:val="20"/>
                 <w:rtl w:val="0"/>
               </w:rPr>
               <w:t xml:space="preserve">1.0</w:t>
@@ -631,41 +653,18 @@
           </w:tcPr>
           <w:p>
             <w:pPr>
-              <w:rPr/>
-            </w:pPr>
-            <w:r>
-              <w:rPr>
+              <w:rPr>
+                <w:sz w:val="20"/>
+                <w:szCs w:val="20"/>
+              </w:rPr>
+            </w:pPr>
+            <w:r>
+              <w:rPr>
+                <w:sz w:val="20"/>
+                <w:szCs w:val="20"/>
                 <w:rtl w:val="0"/>
               </w:rPr>
               <w:t xml:space="preserve">Danna</w:t>
-            </w:r>
-          </w:p>
-        </w:tc>
-        <w:tc>
-          <w:tcPr>
-            <w:tcBorders>
-              <w:top w:color="bdc3c7" w:space="0" w:sz="4" w:val="single"/>
-              <w:left w:color="bdc3c7" w:space="0" w:sz="4" w:val="single"/>
-              <w:bottom w:color="bdc3c7" w:space="0" w:sz="4" w:val="single"/>
-              <w:right w:color="bdc3c7" w:space="0" w:sz="4" w:val="single"/>
-            </w:tcBorders>
-            <w:shd w:fill="f5f7fa" w:val="clear"/>
-            <w:tcMar>
-              <w:top w:w="80.0" w:type="dxa"/>
-              <w:left w:w="160.0" w:type="dxa"/>
-              <w:bottom w:w="80.0" w:type="dxa"/>
-              <w:right w:w="160.0" w:type="dxa"/>
-            </w:tcMar>
-          </w:tcPr>
-          <w:p>
-            <w:pPr>
-              <w:rPr/>
-            </w:pPr>
-            <w:r>
-              <w:rPr>
-                <w:rtl w:val="0"/>
-              </w:rPr>
-              <w:t xml:space="preserve">9/04/2026</w:t>
             </w:r>
           </w:p>
         </w:tc>
@@ -687,13 +686,18 @@
           </w:tcPr>
           <w:p>
             <w:pPr>
-              <w:rPr/>
-            </w:pPr>
-            <w:r>
-              <w:rPr>
-                <w:rtl w:val="0"/>
-              </w:rPr>
-              <w:t xml:space="preserve">Desarrollo de seccion 3: Requisitos Funcionales</w:t>
+              <w:rPr>
+                <w:sz w:val="20"/>
+                <w:szCs w:val="20"/>
+              </w:rPr>
+            </w:pPr>
+            <w:r>
+              <w:rPr>
+                <w:sz w:val="20"/>
+                <w:szCs w:val="20"/>
+                <w:rtl w:val="0"/>
+              </w:rPr>
+              <w:t xml:space="preserve">9/04/2026</w:t>
             </w:r>
           </w:p>
         </w:tc>
@@ -715,10 +719,48 @@
           </w:tcPr>
           <w:p>
             <w:pPr>
-              <w:rPr/>
-            </w:pPr>
-            <w:r>
-              <w:rPr>
+              <w:rPr>
+                <w:sz w:val="20"/>
+                <w:szCs w:val="20"/>
+              </w:rPr>
+            </w:pPr>
+            <w:r>
+              <w:rPr>
+                <w:sz w:val="20"/>
+                <w:szCs w:val="20"/>
+                <w:rtl w:val="0"/>
+              </w:rPr>
+              <w:t xml:space="preserve">Desarrollo de seccion 3: Requisitos Funcionales</w:t>
+            </w:r>
+          </w:p>
+        </w:tc>
+        <w:tc>
+          <w:tcPr>
+            <w:tcBorders>
+              <w:top w:color="bdc3c7" w:space="0" w:sz="4" w:val="single"/>
+              <w:left w:color="bdc3c7" w:space="0" w:sz="4" w:val="single"/>
+              <w:bottom w:color="bdc3c7" w:space="0" w:sz="4" w:val="single"/>
+              <w:right w:color="bdc3c7" w:space="0" w:sz="4" w:val="single"/>
+            </w:tcBorders>
+            <w:shd w:fill="ffffff" w:val="clear"/>
+            <w:tcMar>
+              <w:top w:w="80.0" w:type="dxa"/>
+              <w:left w:w="160.0" w:type="dxa"/>
+              <w:bottom w:w="80.0" w:type="dxa"/>
+              <w:right w:w="160.0" w:type="dxa"/>
+            </w:tcMar>
+          </w:tcPr>
+          <w:p>
+            <w:pPr>
+              <w:rPr>
+                <w:sz w:val="20"/>
+                <w:szCs w:val="20"/>
+              </w:rPr>
+            </w:pPr>
+            <w:r>
+              <w:rPr>
+                <w:sz w:val="20"/>
+                <w:szCs w:val="20"/>
                 <w:rtl w:val="0"/>
               </w:rPr>
               <w:t xml:space="preserve">1.1</w:t>
@@ -749,10 +791,15 @@
           </w:tcPr>
           <w:p>
             <w:pPr>
-              <w:rPr/>
-            </w:pPr>
-            <w:r>
-              <w:rPr>
+              <w:rPr>
+                <w:sz w:val="20"/>
+                <w:szCs w:val="20"/>
+              </w:rPr>
+            </w:pPr>
+            <w:r>
+              <w:rPr>
+                <w:sz w:val="20"/>
+                <w:szCs w:val="20"/>
                 <w:rtl w:val="0"/>
               </w:rPr>
               <w:t xml:space="preserve">Juliana</w:t>
@@ -777,10 +824,15 @@
           </w:tcPr>
           <w:p>
             <w:pPr>
-              <w:rPr/>
-            </w:pPr>
-            <w:r>
-              <w:rPr>
+              <w:rPr>
+                <w:sz w:val="20"/>
+                <w:szCs w:val="20"/>
+              </w:rPr>
+            </w:pPr>
+            <w:r>
+              <w:rPr>
+                <w:sz w:val="20"/>
+                <w:szCs w:val="20"/>
                 <w:rtl w:val="0"/>
               </w:rPr>
               <w:t xml:space="preserve">11/04/2026</w:t>
@@ -805,10 +857,15 @@
           </w:tcPr>
           <w:p>
             <w:pPr>
-              <w:rPr/>
-            </w:pPr>
-            <w:r>
-              <w:rPr>
+              <w:rPr>
+                <w:sz w:val="20"/>
+                <w:szCs w:val="20"/>
+              </w:rPr>
+            </w:pPr>
+            <w:r>
+              <w:rPr>
+                <w:sz w:val="20"/>
+                <w:szCs w:val="20"/>
                 <w:rtl w:val="0"/>
               </w:rPr>
               <w:t xml:space="preserve">Desarrollo de seccion 3: Historias de Usuario</w:t>
@@ -833,10 +890,15 @@
           </w:tcPr>
           <w:p>
             <w:pPr>
-              <w:rPr/>
-            </w:pPr>
-            <w:r>
-              <w:rPr>
+              <w:rPr>
+                <w:sz w:val="20"/>
+                <w:szCs w:val="20"/>
+              </w:rPr>
+            </w:pPr>
+            <w:r>
+              <w:rPr>
+                <w:sz w:val="20"/>
+                <w:szCs w:val="20"/>
                 <w:rtl w:val="0"/>
               </w:rPr>
               <w:t xml:space="preserve">1.2</w:t>
@@ -867,10 +929,15 @@
           </w:tcPr>
           <w:p>
             <w:pPr>
-              <w:rPr/>
-            </w:pPr>
-            <w:r>
-              <w:rPr>
+              <w:rPr>
+                <w:sz w:val="20"/>
+                <w:szCs w:val="20"/>
+              </w:rPr>
+            </w:pPr>
+            <w:r>
+              <w:rPr>
+                <w:sz w:val="20"/>
+                <w:szCs w:val="20"/>
                 <w:rtl w:val="0"/>
               </w:rPr>
               <w:t xml:space="preserve">Juliana</w:t>
@@ -895,10 +962,15 @@
           </w:tcPr>
           <w:p>
             <w:pPr>
-              <w:rPr/>
-            </w:pPr>
-            <w:r>
-              <w:rPr>
+              <w:rPr>
+                <w:sz w:val="20"/>
+                <w:szCs w:val="20"/>
+              </w:rPr>
+            </w:pPr>
+            <w:r>
+              <w:rPr>
+                <w:sz w:val="20"/>
+                <w:szCs w:val="20"/>
                 <w:rtl w:val="0"/>
               </w:rPr>
               <w:t xml:space="preserve">12/04/2026</w:t>
@@ -923,10 +995,15 @@
           </w:tcPr>
           <w:p>
             <w:pPr>
-              <w:rPr/>
-            </w:pPr>
-            <w:r>
-              <w:rPr>
+              <w:rPr>
+                <w:sz w:val="20"/>
+                <w:szCs w:val="20"/>
+              </w:rPr>
+            </w:pPr>
+            <w:r>
+              <w:rPr>
+                <w:sz w:val="20"/>
+                <w:szCs w:val="20"/>
                 <w:rtl w:val="0"/>
               </w:rPr>
               <w:t xml:space="preserve">Desarrollo de sección 1:  propósito del documento, alcance del producto, Definiciones, Acrónimos y Abreviaciones, Referencias.</w:t>
@@ -951,10 +1028,15 @@
           </w:tcPr>
           <w:p>
             <w:pPr>
-              <w:rPr/>
-            </w:pPr>
-            <w:r>
-              <w:rPr>
+              <w:rPr>
+                <w:sz w:val="20"/>
+                <w:szCs w:val="20"/>
+              </w:rPr>
+            </w:pPr>
+            <w:r>
+              <w:rPr>
+                <w:sz w:val="20"/>
+                <w:szCs w:val="20"/>
                 <w:rtl w:val="0"/>
               </w:rPr>
               <w:t xml:space="preserve">1.3</w:t>
@@ -985,10 +1067,15 @@
           </w:tcPr>
           <w:p>
             <w:pPr>
-              <w:rPr/>
-            </w:pPr>
-            <w:r>
-              <w:rPr>
+              <w:rPr>
+                <w:sz w:val="20"/>
+                <w:szCs w:val="20"/>
+              </w:rPr>
+            </w:pPr>
+            <w:r>
+              <w:rPr>
+                <w:sz w:val="20"/>
+                <w:szCs w:val="20"/>
                 <w:rtl w:val="0"/>
               </w:rPr>
               <w:t xml:space="preserve">Juliana</w:t>
@@ -1013,10 +1100,15 @@
           </w:tcPr>
           <w:p>
             <w:pPr>
-              <w:rPr/>
-            </w:pPr>
-            <w:r>
-              <w:rPr>
+              <w:rPr>
+                <w:sz w:val="20"/>
+                <w:szCs w:val="20"/>
+              </w:rPr>
+            </w:pPr>
+            <w:r>
+              <w:rPr>
+                <w:sz w:val="20"/>
+                <w:szCs w:val="20"/>
                 <w:rtl w:val="0"/>
               </w:rPr>
               <w:t xml:space="preserve">12/04/2026</w:t>
@@ -1041,10 +1133,15 @@
           </w:tcPr>
           <w:p>
             <w:pPr>
-              <w:rPr/>
-            </w:pPr>
-            <w:r>
-              <w:rPr>
+              <w:rPr>
+                <w:sz w:val="20"/>
+                <w:szCs w:val="20"/>
+              </w:rPr>
+            </w:pPr>
+            <w:r>
+              <w:rPr>
+                <w:sz w:val="20"/>
+                <w:szCs w:val="20"/>
                 <w:rtl w:val="0"/>
               </w:rPr>
               <w:t xml:space="preserve">Desarrollo de sección 2:  Perspectiva del Producto, Funciones del Producto, Restricciones del Producto, Supuestos y Dependencias.</w:t>
@@ -1069,10 +1166,15 @@
           </w:tcPr>
           <w:p>
             <w:pPr>
-              <w:rPr/>
-            </w:pPr>
-            <w:r>
-              <w:rPr>
+              <w:rPr>
+                <w:sz w:val="20"/>
+                <w:szCs w:val="20"/>
+              </w:rPr>
+            </w:pPr>
+            <w:r>
+              <w:rPr>
+                <w:sz w:val="20"/>
+                <w:szCs w:val="20"/>
                 <w:rtl w:val="0"/>
               </w:rPr>
               <w:t xml:space="preserve">1.4</w:t>

</xml_diff>